<commit_message>
Task(1037861): FT Sub Page for EJ2 Grid Customization
</commit_message>
<xml_diff>
--- a/Word files/template-customization.docx
+++ b/Word files/template-customization.docx
@@ -30,12 +30,6 @@
       </w:r>
     </w:p>
     <w:p>
-      <w:pPr>
-        <w:rPr>
-          <w:b/>
-          <w:bCs/>
-        </w:rPr>
-      </w:pPr>
       <w:r>
         <w:rPr>
           <w:b/>
@@ -47,7 +41,7 @@
         <w:t xml:space="preserve"> – </w:t>
       </w:r>
       <w:r>
-        <w:t>Craft Rich Experiences with Powerful Grid Customization</w:t>
+        <w:t>Build Exceptional User Experiences with a Fully Customizable React Data Grid</w:t>
       </w:r>
     </w:p>
     <w:p>
@@ -62,7 +56,13 @@
         <w:t xml:space="preserve"> – </w:t>
       </w:r>
       <w:r>
-        <w:t>Customize columns, cells, templates, editors, and layouts to create highly interactive data grids tailored to your application's needs.</w:t>
+        <w:t>Create highly interactive data grid experiences with flexible template customization. Design custom cell, row, header, and editor templates using React</w:t>
+      </w:r>
+      <w:r>
+        <w:t xml:space="preserve"> Data Grid</w:t>
+      </w:r>
+      <w:r>
+        <w:t xml:space="preserve"> components to display rich content, actions, and data exactly the way your application requires.</w:t>
       </w:r>
       <w:r>
         <w:br/>
@@ -71,1357 +71,23 @@
         <w:br/>
         <w:t xml:space="preserve">View Demo – </w:t>
       </w:r>
-      <w:r>
-        <w:t>https://ej2.syncfusion.com/react/demos/#/tailwind3/grid/column-template</w:t>
+      <w:hyperlink r:id="rId5" w:history="1">
+        <w:r>
+          <w:rPr>
+            <w:rStyle w:val="Hyperlink"/>
+          </w:rPr>
+          <w:t>https://ej2.syncfusion.com/react/demos/#/tailwind3/grid/column-template</w:t>
+        </w:r>
+      </w:hyperlink>
+      <w:r>
+        <w:t xml:space="preserve"> </w:t>
       </w:r>
     </w:p>
     <w:p>
       <w:r>
         <w:t xml:space="preserve">Explore Documentation – </w:t>
       </w:r>
-      <w:r>
-        <w:t>https://ej2.syncfusion.com/react/documentation/grid/columns/column-template</w:t>
-      </w:r>
-    </w:p>
-    <w:p>
-      <w:pPr>
-        <w:pStyle w:val="Heading1"/>
-      </w:pPr>
-      <w:r>
-        <w:t>2. Live Sample or Demo Preview</w:t>
-      </w:r>
-    </w:p>
-    <w:p/>
-    <w:p>
-      <w:r>
-        <w:rPr>
-          <w:b/>
-          <w:bCs/>
-        </w:rPr>
-        <w:t>Hero eyebrow</w:t>
-      </w:r>
-      <w:r>
-        <w:t xml:space="preserve"> – Interactive Demo</w:t>
-      </w:r>
-    </w:p>
-    <w:p>
-      <w:r>
-        <w:rPr>
-          <w:b/>
-          <w:bCs/>
-        </w:rPr>
-        <w:t>Main title</w:t>
-      </w:r>
-      <w:r>
-        <w:t xml:space="preserve"> – </w:t>
-      </w:r>
-      <w:r>
-        <w:t>Try Different Templates</w:t>
-      </w:r>
-      <w:r>
-        <w:t xml:space="preserve"> Customization</w:t>
-      </w:r>
-      <w:r>
-        <w:t xml:space="preserve"> in Action</w:t>
-      </w:r>
-    </w:p>
-    <w:p>
-      <w:r>
-        <w:rPr>
-          <w:b/>
-          <w:bCs/>
-        </w:rPr>
-        <w:t>Subtitle</w:t>
-      </w:r>
-      <w:r>
-        <w:t xml:space="preserve"> – </w:t>
-      </w:r>
-      <w:r>
-        <w:t>Explore various template types to discover how you can customize your grid's appearance and functionality.</w:t>
-      </w:r>
-    </w:p>
-    <w:p>
-      <w:r>
-        <w:t>Preview sample –</w:t>
-      </w:r>
-    </w:p>
-    <w:p/>
-    <w:p>
-      <w:pPr>
-        <w:pStyle w:val="Heading1"/>
-      </w:pPr>
-      <w:r>
-        <w:t>3. Why the Templates Customization matters?</w:t>
-      </w:r>
-    </w:p>
-    <w:p/>
-    <w:p>
-      <w:r>
-        <w:rPr>
-          <w:b/>
-          <w:bCs/>
-        </w:rPr>
-        <w:t>Hero eyebrow</w:t>
-      </w:r>
-      <w:r>
-        <w:t xml:space="preserve"> – </w:t>
-      </w:r>
-      <w:r>
-        <w:t>Why Template</w:t>
-      </w:r>
-      <w:r>
-        <w:t>s Customization</w:t>
-      </w:r>
-      <w:r>
-        <w:t xml:space="preserve"> Matter</w:t>
-      </w:r>
-    </w:p>
-    <w:p>
-      <w:r>
-        <w:rPr>
-          <w:b/>
-          <w:bCs/>
-        </w:rPr>
-        <w:t>Main title</w:t>
-      </w:r>
-      <w:r>
-        <w:t xml:space="preserve"> – </w:t>
-      </w:r>
-      <w:r>
-        <w:t>Develop Customized Data Experiences Tailored to Your Brand</w:t>
-      </w:r>
-    </w:p>
-    <w:p>
-      <w:r>
-        <w:rPr>
-          <w:b/>
-          <w:bCs/>
-        </w:rPr>
-        <w:t>Content</w:t>
-      </w:r>
-      <w:r>
-        <w:t xml:space="preserve"> – </w:t>
-      </w:r>
-      <w:r>
-        <w:br/>
-      </w:r>
-      <w:r>
-        <w:t>Template customization matters because it enables organizations to tailor layouts, content, and interface elements to their specific business needs while maintaining consistency. It supports rich and interactive experiences through customized headers, rows, cells, and components. Theme customization enhances the visual appearance by managing colors, fonts, spacing, and branding elements. Together, they create cohesive, user-friendly, and professional applications.</w:t>
-      </w:r>
-    </w:p>
-    <w:p>
-      <w:pPr>
-        <w:rPr>
-          <w:b/>
-          <w:bCs/>
-        </w:rPr>
-      </w:pPr>
-      <w:r>
-        <w:rPr>
-          <w:b/>
-          <w:bCs/>
-        </w:rPr>
-        <w:t>Key capabilities –</w:t>
-      </w:r>
-    </w:p>
-    <w:p>
-      <w:pPr>
-        <w:pStyle w:val="ListParagraph"/>
-        <w:numPr>
-          <w:ilvl w:val="0"/>
-          <w:numId w:val="1"/>
-        </w:numPr>
-        <w:spacing w:line="278" w:lineRule="auto"/>
-      </w:pPr>
-      <w:r>
-        <w:t>Custom Cell Rendering</w:t>
-      </w:r>
-    </w:p>
-    <w:p>
-      <w:pPr>
-        <w:pStyle w:val="ListParagraph"/>
-        <w:numPr>
-          <w:ilvl w:val="0"/>
-          <w:numId w:val="1"/>
-        </w:numPr>
-        <w:spacing w:line="278" w:lineRule="auto"/>
-      </w:pPr>
-      <w:r>
-        <w:lastRenderedPageBreak/>
-        <w:t>Brand-Consistent Design</w:t>
-      </w:r>
-    </w:p>
-    <w:p>
-      <w:pPr>
-        <w:pStyle w:val="ListParagraph"/>
-        <w:numPr>
-          <w:ilvl w:val="0"/>
-          <w:numId w:val="1"/>
-        </w:numPr>
-        <w:spacing w:line="278" w:lineRule="auto"/>
-      </w:pPr>
-      <w:r>
-        <w:t>Interactive UI Components</w:t>
-      </w:r>
-    </w:p>
-    <w:p>
-      <w:pPr>
-        <w:pStyle w:val="ListParagraph"/>
-        <w:numPr>
-          <w:ilvl w:val="0"/>
-          <w:numId w:val="1"/>
-        </w:numPr>
-        <w:spacing w:line="278" w:lineRule="auto"/>
-      </w:pPr>
-      <w:r>
-        <w:t>Advanced Data Layouts</w:t>
-      </w:r>
-    </w:p>
-    <w:p>
-      <w:pPr>
-        <w:pStyle w:val="ListParagraph"/>
-        <w:numPr>
-          <w:ilvl w:val="0"/>
-          <w:numId w:val="1"/>
-        </w:numPr>
-        <w:spacing w:line="278" w:lineRule="auto"/>
-      </w:pPr>
-      <w:r>
-        <w:t>Responsive Design Support</w:t>
-      </w:r>
-    </w:p>
-    <w:p>
-      <w:pPr>
-        <w:pStyle w:val="ListParagraph"/>
-        <w:numPr>
-          <w:ilvl w:val="0"/>
-          <w:numId w:val="1"/>
-        </w:numPr>
-        <w:spacing w:line="278" w:lineRule="auto"/>
-      </w:pPr>
-      <w:r>
-        <w:t>Flexible Business-Specific Interfaces</w:t>
-      </w:r>
-    </w:p>
-    <w:p>
-      <w:pPr>
-        <w:pStyle w:val="ListParagraph"/>
-        <w:numPr>
-          <w:ilvl w:val="0"/>
-          <w:numId w:val="1"/>
-        </w:numPr>
-        <w:spacing w:line="278" w:lineRule="auto"/>
-      </w:pPr>
-      <w:r>
-        <w:t>Row Layout Customization</w:t>
-      </w:r>
-    </w:p>
-    <w:p>
-      <w:pPr>
-        <w:pStyle w:val="ListParagraph"/>
-        <w:numPr>
-          <w:ilvl w:val="0"/>
-          <w:numId w:val="1"/>
-        </w:numPr>
-        <w:spacing w:line="278" w:lineRule="auto"/>
-      </w:pPr>
-      <w:r>
-        <w:t>Custom Empty-State Messages</w:t>
-      </w:r>
-    </w:p>
-    <w:p>
-      <w:pPr>
-        <w:pStyle w:val="ListParagraph"/>
-        <w:numPr>
-          <w:ilvl w:val="0"/>
-          <w:numId w:val="1"/>
-        </w:numPr>
-        <w:spacing w:line="278" w:lineRule="auto"/>
-      </w:pPr>
-      <w:r>
-        <w:t>Consistent Brand Expression</w:t>
-      </w:r>
-    </w:p>
-    <w:p>
-      <w:pPr>
-        <w:pStyle w:val="ListParagraph"/>
-        <w:numPr>
-          <w:ilvl w:val="0"/>
-          <w:numId w:val="1"/>
-        </w:numPr>
-        <w:spacing w:line="278" w:lineRule="auto"/>
-      </w:pPr>
-      <w:r>
-        <w:t>Multiple Theme Support</w:t>
-      </w:r>
-    </w:p>
-    <w:p>
-      <w:pPr>
-        <w:pStyle w:val="ListParagraph"/>
-        <w:numPr>
-          <w:ilvl w:val="0"/>
-          <w:numId w:val="1"/>
-        </w:numPr>
-        <w:spacing w:line="278" w:lineRule="auto"/>
-      </w:pPr>
-      <w:r>
-        <w:t>Accessibility Built-In</w:t>
-      </w:r>
-    </w:p>
-    <w:p>
-      <w:pPr>
-        <w:pStyle w:val="Heading1"/>
-      </w:pPr>
-      <w:r>
-        <w:t>4. Choose the Right Approach</w:t>
-      </w:r>
-    </w:p>
-    <w:p/>
-    <w:p>
-      <w:r>
-        <w:rPr>
-          <w:b/>
-          <w:bCs/>
-        </w:rPr>
-        <w:t>Hero eyebrow</w:t>
-      </w:r>
-      <w:r>
-        <w:t xml:space="preserve"> – </w:t>
-      </w:r>
-      <w:r>
-        <w:t>Find the Right Template for Your Requirements</w:t>
-      </w:r>
-    </w:p>
-    <w:p>
-      <w:r>
-        <w:rPr>
-          <w:b/>
-          <w:bCs/>
-        </w:rPr>
-        <w:t>Main title</w:t>
-      </w:r>
-      <w:r>
-        <w:t xml:space="preserve"> – </w:t>
-      </w:r>
-      <w:r>
-        <w:t xml:space="preserve">Choose the Right Template </w:t>
-      </w:r>
-      <w:r>
-        <w:t xml:space="preserve">Customization </w:t>
-      </w:r>
-      <w:r>
-        <w:t>for Your Workflow</w:t>
-      </w:r>
-    </w:p>
-    <w:p>
-      <w:r>
-        <w:rPr>
-          <w:b/>
-          <w:bCs/>
-        </w:rPr>
-        <w:t>Subtitle</w:t>
-      </w:r>
-      <w:r>
-        <w:t xml:space="preserve"> – </w:t>
-      </w:r>
-      <w:r>
-        <w:t>Choose the most appropriate template customization approach based on your user interface and business requirements.</w:t>
-      </w:r>
-    </w:p>
-    <w:p>
-      <w:pPr>
-        <w:rPr>
-          <w:b/>
-          <w:bCs/>
-        </w:rPr>
-      </w:pPr>
-      <w:r>
-        <w:rPr>
-          <w:b/>
-          <w:bCs/>
-        </w:rPr>
-        <w:t>Option 1:</w:t>
-      </w:r>
-    </w:p>
-    <w:p>
-      <w:pPr>
-        <w:rPr>
-          <w:b/>
-          <w:bCs/>
-        </w:rPr>
-      </w:pPr>
-      <w:r>
-        <w:rPr>
-          <w:b/>
-          <w:bCs/>
-        </w:rPr>
-        <w:t>Title - Column Template</w:t>
-      </w:r>
-    </w:p>
-    <w:p>
-      <w:r>
-        <w:rPr>
-          <w:b/>
-          <w:bCs/>
-        </w:rPr>
-        <w:t>Content</w:t>
-      </w:r>
-      <w:r>
-        <w:t xml:space="preserve"> – </w:t>
-      </w:r>
-      <w:r>
-        <w:t>Customize individual cell content with HTML, formatted text, images, badges, and interactive controls.</w:t>
-      </w:r>
-    </w:p>
-    <w:p>
-      <w:r>
-        <w:rPr>
-          <w:b/>
-          <w:bCs/>
-        </w:rPr>
-        <w:t>Best For</w:t>
-      </w:r>
-      <w:r>
-        <w:t xml:space="preserve"> – </w:t>
-      </w:r>
-      <w:r>
-        <w:t>Status indicators, formatted values, action buttons, badges</w:t>
-      </w:r>
-    </w:p>
-    <w:p>
-      <w:pPr>
-        <w:rPr>
-          <w:b/>
-          <w:bCs/>
-        </w:rPr>
-      </w:pPr>
-      <w:r>
-        <w:rPr>
-          <w:b/>
-          <w:bCs/>
-        </w:rPr>
-        <w:t>Use When</w:t>
-      </w:r>
-      <w:r>
-        <w:t xml:space="preserve"> – C</w:t>
-      </w:r>
-      <w:r>
-        <w:t>ells need custom rendering beyond plain text.</w:t>
-      </w:r>
-      <w:r>
-        <w:br/>
-      </w:r>
-      <w:r>
-        <w:br/>
-      </w:r>
-      <w:r>
-        <w:rPr>
-          <w:b/>
-          <w:bCs/>
-        </w:rPr>
-        <w:t>Option 2:</w:t>
-      </w:r>
-    </w:p>
-    <w:p>
-      <w:pPr>
-        <w:rPr>
-          <w:b/>
-          <w:bCs/>
-        </w:rPr>
-      </w:pPr>
-      <w:r>
-        <w:rPr>
-          <w:b/>
-          <w:bCs/>
-        </w:rPr>
-        <w:t>Title – Header Template</w:t>
-      </w:r>
-    </w:p>
-    <w:p>
-      <w:r>
-        <w:rPr>
-          <w:b/>
-          <w:bCs/>
-        </w:rPr>
-        <w:t xml:space="preserve">Content </w:t>
-      </w:r>
-      <w:r>
-        <w:t xml:space="preserve">– </w:t>
-      </w:r>
-      <w:r>
-        <w:t>Design custom column headers with icons, sort indicators, filter buttons, and advanced header layouts.</w:t>
-      </w:r>
-      <w:r>
-        <w:br/>
-      </w:r>
-      <w:r>
-        <w:br/>
-      </w:r>
-      <w:r>
-        <w:rPr>
-          <w:b/>
-          <w:bCs/>
-        </w:rPr>
-        <w:t>Best For</w:t>
-      </w:r>
-      <w:r>
-        <w:t xml:space="preserve"> – </w:t>
-      </w:r>
-      <w:r>
-        <w:t>Custom sorting, advanced filtering, header icons</w:t>
-      </w:r>
-    </w:p>
-    <w:p>
-      <w:r>
-        <w:rPr>
-          <w:b/>
-          <w:bCs/>
-        </w:rPr>
-        <w:t>Use When</w:t>
-      </w:r>
-      <w:r>
-        <w:t xml:space="preserve"> –</w:t>
-      </w:r>
-      <w:r>
-        <w:rPr>
-          <w:rFonts w:ascii="Segoe UI" w:hAnsi="Segoe UI" w:cs="Segoe UI"/>
-          <w:color w:val="555555"/>
-          <w:sz w:val="20"/>
-          <w:szCs w:val="20"/>
-          <w:shd w:val="clear" w:color="auto" w:fill="F9FAFB"/>
-        </w:rPr>
-        <w:t xml:space="preserve"> </w:t>
-      </w:r>
-      <w:r>
-        <w:t>H</w:t>
-      </w:r>
-      <w:r>
-        <w:t>eaders need interactive elements or custom styling.</w:t>
-      </w:r>
-    </w:p>
-    <w:p>
-      <w:pPr>
-        <w:rPr>
-          <w:b/>
-          <w:bCs/>
-        </w:rPr>
-      </w:pPr>
-      <w:r>
-        <w:rPr>
-          <w:b/>
-          <w:bCs/>
-        </w:rPr>
-        <w:t>Option 3:</w:t>
-      </w:r>
-    </w:p>
-    <w:p>
-      <w:pPr>
-        <w:rPr>
-          <w:b/>
-          <w:bCs/>
-        </w:rPr>
-      </w:pPr>
-      <w:r>
-        <w:rPr>
-          <w:b/>
-          <w:bCs/>
-        </w:rPr>
-        <w:t>Title – Detail Template</w:t>
-      </w:r>
-    </w:p>
-    <w:p>
-      <w:r>
-        <w:rPr>
-          <w:b/>
-          <w:bCs/>
-        </w:rPr>
-        <w:t>Content</w:t>
-      </w:r>
-      <w:r>
-        <w:t xml:space="preserve"> – </w:t>
-      </w:r>
-      <w:r>
-        <w:t>Create expandable row details showing comprehensive information, nested tables, or related records.</w:t>
-      </w:r>
-      <w:r>
-        <w:br/>
-      </w:r>
-      <w:r>
-        <w:lastRenderedPageBreak/>
-        <w:br/>
-      </w:r>
-      <w:r>
-        <w:rPr>
-          <w:b/>
-          <w:bCs/>
-        </w:rPr>
-        <w:t xml:space="preserve">Best For </w:t>
-      </w:r>
-      <w:r>
-        <w:t xml:space="preserve">– </w:t>
-      </w:r>
-      <w:r>
-        <w:t>Master-detail layouts, expandable rows, nested data</w:t>
-      </w:r>
-    </w:p>
-    <w:p>
-      <w:r>
-        <w:rPr>
-          <w:b/>
-          <w:bCs/>
-        </w:rPr>
-        <w:t>Use When -</w:t>
-      </w:r>
-      <w:r>
-        <w:t xml:space="preserve"> R</w:t>
-      </w:r>
-      <w:r>
-        <w:t>ows need to display additional detailed information.</w:t>
-      </w:r>
-    </w:p>
-    <w:p>
-      <w:pPr>
-        <w:rPr>
-          <w:b/>
-          <w:bCs/>
-        </w:rPr>
-      </w:pPr>
-      <w:r>
-        <w:rPr>
-          <w:b/>
-          <w:bCs/>
-        </w:rPr>
-        <w:t xml:space="preserve">Option </w:t>
-      </w:r>
-      <w:r>
-        <w:rPr>
-          <w:b/>
-          <w:bCs/>
-        </w:rPr>
-        <w:t>4</w:t>
-      </w:r>
-      <w:r>
-        <w:rPr>
-          <w:b/>
-          <w:bCs/>
-        </w:rPr>
-        <w:t>:</w:t>
-      </w:r>
-    </w:p>
-    <w:p>
-      <w:pPr>
-        <w:rPr>
-          <w:b/>
-          <w:bCs/>
-        </w:rPr>
-      </w:pPr>
-      <w:r>
-        <w:rPr>
-          <w:b/>
-          <w:bCs/>
-        </w:rPr>
-        <w:t>Title - CSS Variables</w:t>
-      </w:r>
-    </w:p>
-    <w:p>
-      <w:r>
-        <w:rPr>
-          <w:b/>
-          <w:bCs/>
-        </w:rPr>
-        <w:t>Content</w:t>
-      </w:r>
-      <w:r>
-        <w:t xml:space="preserve"> – </w:t>
-      </w:r>
-      <w:r>
-        <w:t>Override theme colors using CSS custom properties. Perfect for simple color adjustments and dynamic theme switching.</w:t>
-      </w:r>
-    </w:p>
-    <w:p>
-      <w:r>
-        <w:rPr>
-          <w:b/>
-          <w:bCs/>
-        </w:rPr>
-        <w:t>Best For</w:t>
-      </w:r>
-      <w:r>
-        <w:t xml:space="preserve"> – </w:t>
-      </w:r>
-      <w:r>
-        <w:t>Light/dark mode toggling, simple brand color updates</w:t>
-      </w:r>
-    </w:p>
-    <w:p>
-      <w:r>
-        <w:rPr>
-          <w:b/>
-          <w:bCs/>
-        </w:rPr>
-        <w:t>Use When</w:t>
-      </w:r>
-      <w:r>
-        <w:t xml:space="preserve"> – </w:t>
-      </w:r>
-      <w:r>
-        <w:t>You need quick CSS-level customization without code changes</w:t>
-      </w:r>
-    </w:p>
-    <w:p>
-      <w:pPr>
-        <w:rPr>
-          <w:b/>
-          <w:bCs/>
-        </w:rPr>
-      </w:pPr>
-      <w:r>
-        <w:rPr>
-          <w:b/>
-          <w:bCs/>
-        </w:rPr>
-        <w:t xml:space="preserve">Option </w:t>
-      </w:r>
-      <w:r>
-        <w:rPr>
-          <w:b/>
-          <w:bCs/>
-        </w:rPr>
-        <w:t>5</w:t>
-      </w:r>
-      <w:r>
-        <w:rPr>
-          <w:b/>
-          <w:bCs/>
-        </w:rPr>
-        <w:t>:</w:t>
-      </w:r>
-    </w:p>
-    <w:p>
-      <w:pPr>
-        <w:rPr>
-          <w:b/>
-          <w:bCs/>
-        </w:rPr>
-      </w:pPr>
-      <w:r>
-        <w:rPr>
-          <w:b/>
-          <w:bCs/>
-        </w:rPr>
-        <w:t>Title - Theme Configuration</w:t>
-      </w:r>
-    </w:p>
-    <w:p>
-      <w:r>
-        <w:rPr>
-          <w:b/>
-          <w:bCs/>
-        </w:rPr>
-        <w:t>Content</w:t>
-      </w:r>
-      <w:r>
-        <w:t xml:space="preserve"> – Configure the grid using a complete theme object that supports colors, typography, spacing, and individual component styles.</w:t>
-      </w:r>
-    </w:p>
-    <w:p>
-      <w:r>
-        <w:rPr>
-          <w:b/>
-          <w:bCs/>
-        </w:rPr>
-        <w:t>Best For</w:t>
-      </w:r>
-      <w:r>
-        <w:t xml:space="preserve"> – Complete design system implementation, multi-theme support</w:t>
-      </w:r>
-    </w:p>
-    <w:p>
-      <w:r>
-        <w:rPr>
-          <w:b/>
-          <w:bCs/>
-        </w:rPr>
-        <w:t>Use When</w:t>
-      </w:r>
-      <w:r>
-        <w:t xml:space="preserve"> – You have a full design system to implement</w:t>
-      </w:r>
-    </w:p>
-    <w:p>
-      <w:pPr>
-        <w:rPr>
-          <w:b/>
-          <w:bCs/>
-        </w:rPr>
-      </w:pPr>
-      <w:r>
-        <w:rPr>
-          <w:b/>
-          <w:bCs/>
-        </w:rPr>
-        <w:t xml:space="preserve">Option </w:t>
-      </w:r>
-      <w:r>
-        <w:rPr>
-          <w:b/>
-          <w:bCs/>
-        </w:rPr>
-        <w:t>6</w:t>
-      </w:r>
-      <w:r>
-        <w:rPr>
-          <w:b/>
-          <w:bCs/>
-        </w:rPr>
-        <w:t>:</w:t>
-      </w:r>
-    </w:p>
-    <w:p>
-      <w:pPr>
-        <w:rPr>
-          <w:b/>
-          <w:bCs/>
-        </w:rPr>
-      </w:pPr>
-      <w:r>
-        <w:rPr>
-          <w:b/>
-          <w:bCs/>
-        </w:rPr>
-        <w:t>Title - Custom CSS Classes</w:t>
-      </w:r>
-    </w:p>
-    <w:p>
-      <w:r>
-        <w:rPr>
-          <w:b/>
-          <w:bCs/>
-        </w:rPr>
-        <w:t>Content</w:t>
-      </w:r>
-      <w:r>
-        <w:t xml:space="preserve"> – Apply custom CSS classes to grid elements. Provides fine-grained control for advanced styling scenarios.</w:t>
-      </w:r>
-    </w:p>
-    <w:p>
-      <w:r>
-        <w:rPr>
-          <w:b/>
-          <w:bCs/>
-        </w:rPr>
-        <w:t>Best For</w:t>
-      </w:r>
-      <w:r>
-        <w:t xml:space="preserve"> – Complex styling requirements, third-party CSS frameworks</w:t>
-      </w:r>
-    </w:p>
-    <w:p>
-      <w:r>
-        <w:rPr>
-          <w:b/>
-          <w:bCs/>
-        </w:rPr>
-        <w:t>Use When</w:t>
-      </w:r>
-      <w:r>
-        <w:t xml:space="preserve"> – You need complete control over specific element</w:t>
-      </w:r>
-    </w:p>
-    <w:p>
-      <w:pPr>
-        <w:rPr>
-          <w:b/>
-          <w:bCs/>
-        </w:rPr>
-      </w:pPr>
-      <w:r>
-        <w:rPr>
-          <w:b/>
-          <w:bCs/>
-        </w:rPr>
-        <w:t xml:space="preserve">Option </w:t>
-      </w:r>
-      <w:r>
-        <w:rPr>
-          <w:b/>
-          <w:bCs/>
-        </w:rPr>
-        <w:t>7</w:t>
-      </w:r>
-      <w:r>
-        <w:rPr>
-          <w:b/>
-          <w:bCs/>
-        </w:rPr>
-        <w:t>:</w:t>
-      </w:r>
-    </w:p>
-    <w:p>
-      <w:pPr>
-        <w:rPr>
-          <w:b/>
-          <w:bCs/>
-        </w:rPr>
-      </w:pPr>
-      <w:r>
-        <w:rPr>
-          <w:b/>
-          <w:bCs/>
-        </w:rPr>
-        <w:t>Title – Stacked Header Column</w:t>
-      </w:r>
-    </w:p>
-    <w:p>
-      <w:r>
-        <w:rPr>
-          <w:b/>
-          <w:bCs/>
-        </w:rPr>
-        <w:t>Content</w:t>
-      </w:r>
-      <w:r>
-        <w:t xml:space="preserve"> –</w:t>
-      </w:r>
-      <w:r>
-        <w:rPr>
-          <w:rFonts w:ascii="Segoe UI" w:hAnsi="Segoe UI" w:cs="Segoe UI"/>
-          <w:color w:val="666666"/>
-          <w:sz w:val="21"/>
-          <w:szCs w:val="21"/>
-          <w:shd w:val="clear" w:color="auto" w:fill="FFFFFF"/>
-        </w:rPr>
-        <w:t xml:space="preserve"> </w:t>
-      </w:r>
-      <w:r>
-        <w:t>Display multiple fields stacked vertically within a single column for compact, organized layouts.</w:t>
-      </w:r>
-      <w:r>
-        <w:br/>
-      </w:r>
-      <w:r>
-        <w:br/>
-      </w:r>
-      <w:r>
-        <w:rPr>
-          <w:b/>
-          <w:bCs/>
-        </w:rPr>
-        <w:t>Best For</w:t>
-      </w:r>
-      <w:r>
-        <w:t xml:space="preserve"> – </w:t>
-      </w:r>
-      <w:r>
-        <w:t>Multi-field display, compact layouts, grouped data</w:t>
-      </w:r>
-    </w:p>
-    <w:p>
-      <w:r>
-        <w:rPr>
-          <w:b/>
-          <w:bCs/>
-        </w:rPr>
-        <w:t xml:space="preserve">Use When </w:t>
-      </w:r>
-      <w:r>
-        <w:t>- Y</w:t>
-      </w:r>
-      <w:r>
-        <w:t>ou need to show multiple fields in one column.</w:t>
-      </w:r>
-    </w:p>
-    <w:p>
-      <w:pPr>
-        <w:rPr>
-          <w:b/>
-          <w:bCs/>
-        </w:rPr>
-      </w:pPr>
-      <w:r>
-        <w:rPr>
-          <w:b/>
-          <w:bCs/>
-        </w:rPr>
-        <w:t xml:space="preserve">Option </w:t>
-      </w:r>
-      <w:r>
-        <w:rPr>
-          <w:b/>
-          <w:bCs/>
-        </w:rPr>
-        <w:t>8</w:t>
-      </w:r>
-      <w:r>
-        <w:rPr>
-          <w:b/>
-          <w:bCs/>
-        </w:rPr>
-        <w:t>:</w:t>
-      </w:r>
-    </w:p>
-    <w:p>
-      <w:pPr>
-        <w:rPr>
-          <w:b/>
-          <w:bCs/>
-        </w:rPr>
-      </w:pPr>
-      <w:r>
-        <w:rPr>
-          <w:b/>
-          <w:bCs/>
-        </w:rPr>
-        <w:t>Title – Empty Record Template</w:t>
-      </w:r>
-    </w:p>
-    <w:p>
-      <w:r>
-        <w:rPr>
-          <w:b/>
-          <w:bCs/>
-        </w:rPr>
-        <w:t xml:space="preserve">Content </w:t>
-      </w:r>
-      <w:r>
-        <w:t xml:space="preserve">– </w:t>
-      </w:r>
-      <w:r>
-        <w:t>Design custom empty state messages with helpful guidance when no data matches the current filter.</w:t>
-      </w:r>
-      <w:r>
-        <w:br/>
-      </w:r>
-      <w:r>
-        <w:lastRenderedPageBreak/>
-        <w:br/>
-      </w:r>
-      <w:r>
-        <w:rPr>
-          <w:b/>
-          <w:bCs/>
-        </w:rPr>
-        <w:t>Best For</w:t>
-      </w:r>
-      <w:r>
-        <w:t xml:space="preserve"> – </w:t>
-      </w:r>
-      <w:r>
-        <w:t>Empty states, user guidance, call-to-action</w:t>
-      </w:r>
-    </w:p>
-    <w:p>
-      <w:r>
-        <w:rPr>
-          <w:b/>
-          <w:bCs/>
-        </w:rPr>
-        <w:t>Use When</w:t>
-      </w:r>
-      <w:r>
-        <w:t xml:space="preserve"> - Y</w:t>
-      </w:r>
-      <w:r>
-        <w:t>ou want to customize the no-data experience.</w:t>
-      </w:r>
-    </w:p>
-    <w:p>
-      <w:pPr>
-        <w:rPr>
-          <w:b/>
-          <w:bCs/>
-        </w:rPr>
-      </w:pPr>
-      <w:r>
-        <w:rPr>
-          <w:b/>
-          <w:bCs/>
-        </w:rPr>
-        <w:t xml:space="preserve">Option </w:t>
-      </w:r>
-      <w:r>
-        <w:rPr>
-          <w:b/>
-          <w:bCs/>
-        </w:rPr>
-        <w:t>9</w:t>
-      </w:r>
-      <w:r>
-        <w:rPr>
-          <w:b/>
-          <w:bCs/>
-        </w:rPr>
-        <w:t>:</w:t>
-      </w:r>
-    </w:p>
-    <w:p>
-      <w:pPr>
-        <w:rPr>
-          <w:b/>
-          <w:bCs/>
-        </w:rPr>
-      </w:pPr>
-      <w:r>
-        <w:rPr>
-          <w:b/>
-          <w:bCs/>
-        </w:rPr>
-        <w:t>Title – Filter Template</w:t>
-      </w:r>
-    </w:p>
-    <w:p>
-      <w:r>
-        <w:rPr>
-          <w:b/>
-          <w:bCs/>
-        </w:rPr>
-        <w:t>Content</w:t>
-      </w:r>
-      <w:r>
-        <w:t xml:space="preserve"> – </w:t>
-      </w:r>
-      <w:r>
-        <w:t>Build advanced filter UI with custom dropdowns, date pickers, sliders, and filtering logic.</w:t>
-      </w:r>
-      <w:r>
-        <w:br/>
-      </w:r>
-      <w:r>
-        <w:br/>
-      </w:r>
-      <w:r>
-        <w:rPr>
-          <w:b/>
-          <w:bCs/>
-        </w:rPr>
-        <w:t>Best For</w:t>
-      </w:r>
-      <w:r>
-        <w:t xml:space="preserve"> – </w:t>
-      </w:r>
-      <w:r>
-        <w:t>Advanced filters, date ranges, custom search</w:t>
-      </w:r>
-    </w:p>
-    <w:p>
-      <w:r>
-        <w:rPr>
-          <w:b/>
-          <w:bCs/>
-        </w:rPr>
-        <w:t>Use When</w:t>
-      </w:r>
-      <w:r>
-        <w:t xml:space="preserve"> - F</w:t>
-      </w:r>
-      <w:r>
-        <w:t>ilters need custom controls or logic.</w:t>
-      </w:r>
-    </w:p>
-    <w:p>
-      <w:pPr>
-        <w:rPr>
-          <w:b/>
-          <w:bCs/>
-        </w:rPr>
-      </w:pPr>
-      <w:r>
-        <w:rPr>
-          <w:b/>
-          <w:bCs/>
-        </w:rPr>
-        <w:t xml:space="preserve">Option </w:t>
-      </w:r>
-      <w:r>
-        <w:rPr>
-          <w:b/>
-          <w:bCs/>
-        </w:rPr>
-        <w:t>10</w:t>
-      </w:r>
-      <w:r>
-        <w:rPr>
-          <w:b/>
-          <w:bCs/>
-        </w:rPr>
-        <w:t>:</w:t>
-      </w:r>
-    </w:p>
-    <w:p>
-      <w:pPr>
-        <w:rPr>
-          <w:b/>
-          <w:bCs/>
-        </w:rPr>
-      </w:pPr>
-      <w:r>
-        <w:rPr>
-          <w:b/>
-          <w:bCs/>
-        </w:rPr>
-        <w:t>Title – Row Template</w:t>
-      </w:r>
-    </w:p>
-    <w:p>
-      <w:r>
-        <w:rPr>
-          <w:b/>
-          <w:bCs/>
-        </w:rPr>
-        <w:t>Content</w:t>
-      </w:r>
-      <w:r>
-        <w:t xml:space="preserve"> – </w:t>
-      </w:r>
-      <w:r>
-        <w:t>Completely customize entire row layouts with conditional styling, actions, and complex markup.</w:t>
-      </w:r>
-      <w:r>
-        <w:br/>
-      </w:r>
-      <w:r>
-        <w:br/>
-      </w:r>
-      <w:r>
-        <w:rPr>
-          <w:b/>
-          <w:bCs/>
-        </w:rPr>
-        <w:t>Best For</w:t>
-      </w:r>
-      <w:r>
-        <w:t xml:space="preserve"> – </w:t>
-      </w:r>
-      <w:r>
-        <w:t>Custom row layouts, complex hierarchies, conditional styling</w:t>
-      </w:r>
-    </w:p>
-    <w:p>
-      <w:r>
-        <w:rPr>
-          <w:b/>
-          <w:bCs/>
-        </w:rPr>
-        <w:t>Use When</w:t>
-      </w:r>
-      <w:r>
-        <w:t xml:space="preserve"> - E</w:t>
-      </w:r>
-      <w:r>
-        <w:t>ntire rows need custom structure.</w:t>
-      </w:r>
-    </w:p>
-    <w:p>
-      <w:pPr>
-        <w:pStyle w:val="Heading1"/>
-      </w:pPr>
-      <w:r>
-        <w:t>5. Implementation Resources</w:t>
-      </w:r>
-    </w:p>
-    <w:p/>
-    <w:p>
-      <w:r>
-        <w:rPr>
-          <w:b/>
-          <w:bCs/>
-        </w:rPr>
-        <w:t>Hero eyebrow</w:t>
-      </w:r>
-      <w:r>
-        <w:t xml:space="preserve"> – </w:t>
-      </w:r>
-      <w:r>
-        <w:t>Implementation Resources</w:t>
-      </w:r>
-    </w:p>
-    <w:p>
-      <w:r>
-        <w:rPr>
-          <w:b/>
-          <w:bCs/>
-        </w:rPr>
-        <w:t>Main title</w:t>
-      </w:r>
-      <w:r>
-        <w:t xml:space="preserve"> – </w:t>
-      </w:r>
-      <w:r>
-        <w:t>Explore Templates Demos and Documentation</w:t>
-      </w:r>
-    </w:p>
-    <w:p>
-      <w:r>
-        <w:rPr>
-          <w:b/>
-          <w:bCs/>
-        </w:rPr>
-        <w:t>Subtitle</w:t>
-      </w:r>
-      <w:r>
-        <w:t xml:space="preserve"> – </w:t>
-      </w:r>
-      <w:r>
-        <w:t>Explore documentation, demos, guides, and sample implementations to build grid templates efficiently.</w:t>
-      </w:r>
-    </w:p>
-    <w:p>
-      <w:pPr>
-        <w:rPr>
-          <w:b/>
-          <w:bCs/>
-        </w:rPr>
-      </w:pPr>
-      <w:r>
-        <w:rPr>
-          <w:b/>
-          <w:bCs/>
-        </w:rPr>
-        <w:t>Option 1:</w:t>
-      </w:r>
-    </w:p>
-    <w:p>
-      <w:pPr>
-        <w:rPr>
-          <w:b/>
-          <w:bCs/>
-        </w:rPr>
-      </w:pPr>
-      <w:r>
-        <w:rPr>
-          <w:b/>
-          <w:bCs/>
-        </w:rPr>
-        <w:t>Title - Template Documentation</w:t>
-      </w:r>
-    </w:p>
-    <w:p>
-      <w:r>
-        <w:rPr>
-          <w:b/>
-          <w:bCs/>
-        </w:rPr>
-        <w:t>Content</w:t>
-      </w:r>
-      <w:r>
-        <w:t xml:space="preserve"> - </w:t>
-      </w:r>
-      <w:r>
-        <w:t>Complete guide to all template types with API references and configuration options.</w:t>
-      </w:r>
-    </w:p>
-    <w:p>
-      <w:r>
-        <w:rPr>
-          <w:b/>
-          <w:bCs/>
-        </w:rPr>
-        <w:t>Read Guide / View Demo / Try it now –</w:t>
-      </w:r>
-      <w:r>
-        <w:t xml:space="preserve"> </w:t>
-      </w:r>
-      <w:hyperlink r:id="rId5" w:history="1">
+      <w:hyperlink r:id="rId6" w:history="1">
         <w:r>
           <w:rPr>
             <w:rStyle w:val="Hyperlink"/>
@@ -1429,6 +95,1301 @@
           <w:t>https://ej2.syncfusion.com/react/documentation/grid/columns/column-template</w:t>
         </w:r>
       </w:hyperlink>
+    </w:p>
+    <w:p>
+      <w:pPr>
+        <w:pStyle w:val="Heading1"/>
+      </w:pPr>
+      <w:r>
+        <w:t>2. Live Sample or Demo Preview</w:t>
+      </w:r>
+    </w:p>
+    <w:p/>
+    <w:p>
+      <w:r>
+        <w:rPr>
+          <w:b/>
+          <w:bCs/>
+        </w:rPr>
+        <w:t>Hero eyebrow</w:t>
+      </w:r>
+      <w:r>
+        <w:t xml:space="preserve"> – Interactive Demo</w:t>
+      </w:r>
+    </w:p>
+    <w:p>
+      <w:r>
+        <w:rPr>
+          <w:b/>
+          <w:bCs/>
+        </w:rPr>
+        <w:t>Main title</w:t>
+      </w:r>
+      <w:r>
+        <w:t xml:space="preserve"> – </w:t>
+      </w:r>
+      <w:r>
+        <w:t>Explore Template Customization in Action</w:t>
+      </w:r>
+    </w:p>
+    <w:p>
+      <w:r>
+        <w:rPr>
+          <w:b/>
+          <w:bCs/>
+        </w:rPr>
+        <w:t>Subtitle</w:t>
+      </w:r>
+      <w:r>
+        <w:t xml:space="preserve"> – </w:t>
+      </w:r>
+      <w:r>
+        <w:t>Explore a variety of React Data Grid template customization options and discover how to create interactive, personalized, and visually appealing data grid experiences tailored to your application's needs.</w:t>
+      </w:r>
+    </w:p>
+    <w:p>
+      <w:r>
+        <w:t>Preview sample –</w:t>
+      </w:r>
+    </w:p>
+    <w:p/>
+    <w:p>
+      <w:pPr>
+        <w:pStyle w:val="Heading1"/>
+      </w:pPr>
+      <w:r>
+        <w:t>3. Why Template Customization matters?</w:t>
+      </w:r>
+    </w:p>
+    <w:p/>
+    <w:p>
+      <w:r>
+        <w:rPr>
+          <w:b/>
+          <w:bCs/>
+        </w:rPr>
+        <w:t>Hero eyebrow</w:t>
+      </w:r>
+      <w:r>
+        <w:t xml:space="preserve"> – </w:t>
+      </w:r>
+      <w:r>
+        <w:t>Why Template</w:t>
+      </w:r>
+      <w:r>
+        <w:t xml:space="preserve"> Customization</w:t>
+      </w:r>
+      <w:r>
+        <w:t xml:space="preserve"> Matter</w:t>
+      </w:r>
+    </w:p>
+    <w:p>
+      <w:r>
+        <w:rPr>
+          <w:b/>
+          <w:bCs/>
+        </w:rPr>
+        <w:t>Main title</w:t>
+      </w:r>
+      <w:r>
+        <w:t xml:space="preserve"> – </w:t>
+      </w:r>
+      <w:r>
+        <w:t>Customize Cell Rendering to Match Your Brand</w:t>
+      </w:r>
+    </w:p>
+    <w:p>
+      <w:r>
+        <w:rPr>
+          <w:b/>
+          <w:bCs/>
+        </w:rPr>
+        <w:t>Content</w:t>
+      </w:r>
+      <w:r>
+        <w:t xml:space="preserve"> – </w:t>
+      </w:r>
+      <w:r>
+        <w:br/>
+      </w:r>
+      <w:r>
+        <w:t>Template customization empowers you to create interactive data grid experiences tailored to your needs. Customize layouts, headers, rows, cells, and components while maintaining a cohesive visual identity through personalized colors, typography, spacing, and styling. Together, these capabilities help deliver engaging, professional, and user-friendly applications.</w:t>
+      </w:r>
+    </w:p>
+    <w:p/>
+    <w:p>
+      <w:pPr>
+        <w:rPr>
+          <w:b/>
+          <w:bCs/>
+        </w:rPr>
+      </w:pPr>
+      <w:r>
+        <w:rPr>
+          <w:b/>
+          <w:bCs/>
+        </w:rPr>
+        <w:lastRenderedPageBreak/>
+        <w:t>Key capabilities –</w:t>
+      </w:r>
+    </w:p>
+    <w:p>
+      <w:pPr>
+        <w:pStyle w:val="ListParagraph"/>
+        <w:numPr>
+          <w:ilvl w:val="0"/>
+          <w:numId w:val="2"/>
+        </w:numPr>
+      </w:pPr>
+      <w:r>
+        <w:t xml:space="preserve">Header &amp; Content Customization </w:t>
+      </w:r>
+    </w:p>
+    <w:p>
+      <w:pPr>
+        <w:pStyle w:val="ListParagraph"/>
+        <w:numPr>
+          <w:ilvl w:val="0"/>
+          <w:numId w:val="2"/>
+        </w:numPr>
+      </w:pPr>
+      <w:r>
+        <w:t xml:space="preserve">Conditional UI Rendering </w:t>
+      </w:r>
+    </w:p>
+    <w:p>
+      <w:pPr>
+        <w:pStyle w:val="ListParagraph"/>
+        <w:numPr>
+          <w:ilvl w:val="0"/>
+          <w:numId w:val="2"/>
+        </w:numPr>
+      </w:pPr>
+      <w:r>
+        <w:t xml:space="preserve">Custom Component Integration </w:t>
+      </w:r>
+    </w:p>
+    <w:p>
+      <w:pPr>
+        <w:pStyle w:val="ListParagraph"/>
+        <w:numPr>
+          <w:ilvl w:val="0"/>
+          <w:numId w:val="2"/>
+        </w:numPr>
+      </w:pPr>
+      <w:r>
+        <w:t xml:space="preserve">Flexible Layout Design </w:t>
+      </w:r>
+    </w:p>
+    <w:p>
+      <w:pPr>
+        <w:pStyle w:val="ListParagraph"/>
+        <w:numPr>
+          <w:ilvl w:val="0"/>
+          <w:numId w:val="2"/>
+        </w:numPr>
+      </w:pPr>
+      <w:r>
+        <w:t xml:space="preserve">Reusable Template Support </w:t>
+      </w:r>
+    </w:p>
+    <w:p>
+      <w:pPr>
+        <w:pStyle w:val="ListParagraph"/>
+        <w:numPr>
+          <w:ilvl w:val="0"/>
+          <w:numId w:val="2"/>
+        </w:numPr>
+      </w:pPr>
+      <w:r>
+        <w:t xml:space="preserve">Custom Empty State Views </w:t>
+      </w:r>
+    </w:p>
+    <w:p>
+      <w:pPr>
+        <w:pStyle w:val="ListParagraph"/>
+        <w:numPr>
+          <w:ilvl w:val="0"/>
+          <w:numId w:val="2"/>
+        </w:numPr>
+      </w:pPr>
+      <w:r>
+        <w:t xml:space="preserve">Business-Specific Interfaces </w:t>
+      </w:r>
+    </w:p>
+    <w:p>
+      <w:pPr>
+        <w:pStyle w:val="ListParagraph"/>
+        <w:numPr>
+          <w:ilvl w:val="0"/>
+          <w:numId w:val="2"/>
+        </w:numPr>
+      </w:pPr>
+      <w:r>
+        <w:t>End-to-End UI Personalization</w:t>
+      </w:r>
+    </w:p>
+    <w:p>
+      <w:pPr>
+        <w:pStyle w:val="Heading1"/>
+      </w:pPr>
+      <w:r>
+        <w:t>4. Choose the Right Approach</w:t>
+      </w:r>
+    </w:p>
+    <w:p/>
+    <w:p>
+      <w:r>
+        <w:rPr>
+          <w:b/>
+          <w:bCs/>
+        </w:rPr>
+        <w:t>Hero eyebrow</w:t>
+      </w:r>
+      <w:r>
+        <w:t xml:space="preserve"> – </w:t>
+      </w:r>
+      <w:r>
+        <w:t>Find the Right Template for Your Requirements</w:t>
+      </w:r>
+    </w:p>
+    <w:p>
+      <w:r>
+        <w:rPr>
+          <w:b/>
+          <w:bCs/>
+        </w:rPr>
+        <w:t>Main title</w:t>
+      </w:r>
+      <w:r>
+        <w:t xml:space="preserve"> – </w:t>
+      </w:r>
+      <w:r>
+        <w:t xml:space="preserve">Choose the Right Template </w:t>
+      </w:r>
+      <w:r>
+        <w:t xml:space="preserve">Customization </w:t>
+      </w:r>
+      <w:r>
+        <w:t>for Your Workflow</w:t>
+      </w:r>
+    </w:p>
+    <w:p>
+      <w:r>
+        <w:rPr>
+          <w:b/>
+          <w:bCs/>
+        </w:rPr>
+        <w:t>Subtitle</w:t>
+      </w:r>
+      <w:r>
+        <w:t xml:space="preserve"> – </w:t>
+      </w:r>
+      <w:r>
+        <w:t>Choose the most appropriate template customization approach based on your user interface and business requirements.</w:t>
+      </w:r>
+    </w:p>
+    <w:p>
+      <w:pPr>
+        <w:rPr>
+          <w:b/>
+          <w:bCs/>
+        </w:rPr>
+      </w:pPr>
+      <w:r>
+        <w:rPr>
+          <w:b/>
+          <w:bCs/>
+        </w:rPr>
+        <w:t>Option 1:</w:t>
+      </w:r>
+    </w:p>
+    <w:p>
+      <w:pPr>
+        <w:rPr>
+          <w:b/>
+          <w:bCs/>
+        </w:rPr>
+      </w:pPr>
+      <w:r>
+        <w:rPr>
+          <w:b/>
+          <w:bCs/>
+        </w:rPr>
+        <w:t>Title - Column Template</w:t>
+      </w:r>
+    </w:p>
+    <w:p>
+      <w:r>
+        <w:rPr>
+          <w:b/>
+          <w:bCs/>
+        </w:rPr>
+        <w:t>Content</w:t>
+      </w:r>
+      <w:r>
+        <w:t xml:space="preserve"> – </w:t>
+      </w:r>
+      <w:r>
+        <w:t>Customize individual cell content with HTML, formatted text, images, badges, and interactive controls.</w:t>
+      </w:r>
+    </w:p>
+    <w:p>
+      <w:r>
+        <w:rPr>
+          <w:b/>
+          <w:bCs/>
+        </w:rPr>
+        <w:t>Best For</w:t>
+      </w:r>
+      <w:r>
+        <w:t xml:space="preserve"> – </w:t>
+      </w:r>
+      <w:r>
+        <w:t>Status indicators, formatted values, action buttons, badges</w:t>
+      </w:r>
+    </w:p>
+    <w:p>
+      <w:pPr>
+        <w:rPr>
+          <w:b/>
+          <w:bCs/>
+        </w:rPr>
+      </w:pPr>
+      <w:r>
+        <w:rPr>
+          <w:b/>
+          <w:bCs/>
+        </w:rPr>
+        <w:t>Use When</w:t>
+      </w:r>
+      <w:r>
+        <w:t xml:space="preserve"> – C</w:t>
+      </w:r>
+      <w:r>
+        <w:t>ells need custom rendering beyond plain text.</w:t>
+      </w:r>
+      <w:r>
+        <w:br/>
+      </w:r>
+      <w:r>
+        <w:br/>
+      </w:r>
+      <w:r>
+        <w:rPr>
+          <w:b/>
+          <w:bCs/>
+        </w:rPr>
+        <w:t>Option 2:</w:t>
+      </w:r>
+    </w:p>
+    <w:p>
+      <w:pPr>
+        <w:rPr>
+          <w:b/>
+          <w:bCs/>
+        </w:rPr>
+      </w:pPr>
+      <w:r>
+        <w:rPr>
+          <w:b/>
+          <w:bCs/>
+        </w:rPr>
+        <w:t>Title – Header Template</w:t>
+      </w:r>
+    </w:p>
+    <w:p>
+      <w:r>
+        <w:rPr>
+          <w:b/>
+          <w:bCs/>
+        </w:rPr>
+        <w:t xml:space="preserve">Content </w:t>
+      </w:r>
+      <w:r>
+        <w:t xml:space="preserve">– </w:t>
+      </w:r>
+      <w:r>
+        <w:t>Design custom column headers with icons, sort indicators, filter buttons, and advanced header layouts.</w:t>
+      </w:r>
+      <w:r>
+        <w:br/>
+      </w:r>
+      <w:r>
+        <w:br/>
+      </w:r>
+      <w:r>
+        <w:rPr>
+          <w:b/>
+          <w:bCs/>
+        </w:rPr>
+        <w:t>Best For</w:t>
+      </w:r>
+      <w:r>
+        <w:t xml:space="preserve"> – </w:t>
+      </w:r>
+      <w:r>
+        <w:t>Custom sorting, advanced filtering, header icons</w:t>
+      </w:r>
+    </w:p>
+    <w:p>
+      <w:r>
+        <w:rPr>
+          <w:b/>
+          <w:bCs/>
+        </w:rPr>
+        <w:t>Use When</w:t>
+      </w:r>
+      <w:r>
+        <w:t xml:space="preserve"> –</w:t>
+      </w:r>
+      <w:r>
+        <w:rPr>
+          <w:rFonts w:ascii="Segoe UI" w:hAnsi="Segoe UI" w:cs="Segoe UI"/>
+          <w:color w:val="555555"/>
+          <w:sz w:val="20"/>
+          <w:szCs w:val="20"/>
+          <w:shd w:val="clear" w:color="auto" w:fill="F9FAFB"/>
+        </w:rPr>
+        <w:t xml:space="preserve"> </w:t>
+      </w:r>
+      <w:r>
+        <w:t>H</w:t>
+      </w:r>
+      <w:r>
+        <w:t>eaders need interactive elements or custom styling.</w:t>
+      </w:r>
+    </w:p>
+    <w:p>
+      <w:pPr>
+        <w:rPr>
+          <w:b/>
+          <w:bCs/>
+        </w:rPr>
+      </w:pPr>
+      <w:r>
+        <w:rPr>
+          <w:b/>
+          <w:bCs/>
+        </w:rPr>
+        <w:t>Option 3:</w:t>
+      </w:r>
+    </w:p>
+    <w:p>
+      <w:pPr>
+        <w:rPr>
+          <w:b/>
+          <w:bCs/>
+        </w:rPr>
+      </w:pPr>
+      <w:r>
+        <w:rPr>
+          <w:b/>
+          <w:bCs/>
+        </w:rPr>
+        <w:t>Title – Detail Template</w:t>
+      </w:r>
+    </w:p>
+    <w:p>
+      <w:r>
+        <w:rPr>
+          <w:b/>
+          <w:bCs/>
+        </w:rPr>
+        <w:t>Content</w:t>
+      </w:r>
+      <w:r>
+        <w:t xml:space="preserve"> – </w:t>
+      </w:r>
+      <w:r>
+        <w:t>Create expandable row details showing comprehensive information, nested tables, or related records.</w:t>
+      </w:r>
+      <w:r>
+        <w:br/>
+      </w:r>
+      <w:r>
+        <w:lastRenderedPageBreak/>
+        <w:br/>
+      </w:r>
+      <w:r>
+        <w:rPr>
+          <w:b/>
+          <w:bCs/>
+        </w:rPr>
+        <w:t xml:space="preserve">Best For </w:t>
+      </w:r>
+      <w:r>
+        <w:t xml:space="preserve">– </w:t>
+      </w:r>
+      <w:r>
+        <w:t>Master-detail layouts, expandable rows, nested data</w:t>
+      </w:r>
+    </w:p>
+    <w:p>
+      <w:r>
+        <w:rPr>
+          <w:b/>
+          <w:bCs/>
+        </w:rPr>
+        <w:t>Use When -</w:t>
+      </w:r>
+      <w:r>
+        <w:t xml:space="preserve"> R</w:t>
+      </w:r>
+      <w:r>
+        <w:t>ows need to display additional detailed information.</w:t>
+      </w:r>
+    </w:p>
+    <w:p>
+      <w:pPr>
+        <w:rPr>
+          <w:b/>
+          <w:bCs/>
+        </w:rPr>
+      </w:pPr>
+      <w:r>
+        <w:rPr>
+          <w:b/>
+          <w:bCs/>
+        </w:rPr>
+        <w:t xml:space="preserve">Option </w:t>
+      </w:r>
+      <w:r>
+        <w:rPr>
+          <w:b/>
+          <w:bCs/>
+        </w:rPr>
+        <w:t>4</w:t>
+      </w:r>
+      <w:r>
+        <w:rPr>
+          <w:b/>
+          <w:bCs/>
+        </w:rPr>
+        <w:t>:</w:t>
+      </w:r>
+    </w:p>
+    <w:p>
+      <w:pPr>
+        <w:rPr>
+          <w:b/>
+          <w:bCs/>
+        </w:rPr>
+      </w:pPr>
+      <w:r>
+        <w:rPr>
+          <w:b/>
+          <w:bCs/>
+        </w:rPr>
+        <w:t>Title - CSS Variables</w:t>
+      </w:r>
+    </w:p>
+    <w:p>
+      <w:r>
+        <w:rPr>
+          <w:b/>
+          <w:bCs/>
+        </w:rPr>
+        <w:t>Content</w:t>
+      </w:r>
+      <w:r>
+        <w:t xml:space="preserve"> – </w:t>
+      </w:r>
+      <w:r>
+        <w:t>Override theme colors using CSS custom properties. Perfect for simple color adjustments and dynamic theme switching.</w:t>
+      </w:r>
+    </w:p>
+    <w:p>
+      <w:r>
+        <w:rPr>
+          <w:b/>
+          <w:bCs/>
+        </w:rPr>
+        <w:t>Best For</w:t>
+      </w:r>
+      <w:r>
+        <w:t xml:space="preserve"> – </w:t>
+      </w:r>
+      <w:r>
+        <w:t>Light/dark mode toggling, simple brand color updates</w:t>
+      </w:r>
+    </w:p>
+    <w:p>
+      <w:r>
+        <w:rPr>
+          <w:b/>
+          <w:bCs/>
+        </w:rPr>
+        <w:t>Use When</w:t>
+      </w:r>
+      <w:r>
+        <w:t xml:space="preserve"> – </w:t>
+      </w:r>
+      <w:r>
+        <w:t>You need quick CSS-level customization without code changes</w:t>
+      </w:r>
+    </w:p>
+    <w:p>
+      <w:pPr>
+        <w:rPr>
+          <w:b/>
+          <w:bCs/>
+        </w:rPr>
+      </w:pPr>
+      <w:r>
+        <w:rPr>
+          <w:b/>
+          <w:bCs/>
+        </w:rPr>
+        <w:t xml:space="preserve">Option </w:t>
+      </w:r>
+      <w:r>
+        <w:rPr>
+          <w:b/>
+          <w:bCs/>
+        </w:rPr>
+        <w:t>5</w:t>
+      </w:r>
+      <w:r>
+        <w:rPr>
+          <w:b/>
+          <w:bCs/>
+        </w:rPr>
+        <w:t>:</w:t>
+      </w:r>
+    </w:p>
+    <w:p>
+      <w:pPr>
+        <w:rPr>
+          <w:b/>
+          <w:bCs/>
+        </w:rPr>
+      </w:pPr>
+      <w:r>
+        <w:rPr>
+          <w:b/>
+          <w:bCs/>
+        </w:rPr>
+        <w:t>Title - Theme Configuration</w:t>
+      </w:r>
+    </w:p>
+    <w:p>
+      <w:r>
+        <w:rPr>
+          <w:b/>
+          <w:bCs/>
+        </w:rPr>
+        <w:t>Content</w:t>
+      </w:r>
+      <w:r>
+        <w:t xml:space="preserve"> – Configure the grid using a complete theme object that supports colors, typography, spacing, and individual component styles.</w:t>
+      </w:r>
+    </w:p>
+    <w:p>
+      <w:r>
+        <w:rPr>
+          <w:b/>
+          <w:bCs/>
+        </w:rPr>
+        <w:t>Best For</w:t>
+      </w:r>
+      <w:r>
+        <w:t xml:space="preserve"> – Complete design system implementation, multi-theme support</w:t>
+      </w:r>
+    </w:p>
+    <w:p>
+      <w:r>
+        <w:rPr>
+          <w:b/>
+          <w:bCs/>
+        </w:rPr>
+        <w:t>Use When</w:t>
+      </w:r>
+      <w:r>
+        <w:t xml:space="preserve"> – You have a full design system to implement</w:t>
+      </w:r>
+    </w:p>
+    <w:p>
+      <w:pPr>
+        <w:rPr>
+          <w:b/>
+          <w:bCs/>
+        </w:rPr>
+      </w:pPr>
+      <w:r>
+        <w:rPr>
+          <w:b/>
+          <w:bCs/>
+        </w:rPr>
+        <w:t xml:space="preserve">Option </w:t>
+      </w:r>
+      <w:r>
+        <w:rPr>
+          <w:b/>
+          <w:bCs/>
+        </w:rPr>
+        <w:t>6</w:t>
+      </w:r>
+      <w:r>
+        <w:rPr>
+          <w:b/>
+          <w:bCs/>
+        </w:rPr>
+        <w:t>:</w:t>
+      </w:r>
+    </w:p>
+    <w:p>
+      <w:pPr>
+        <w:rPr>
+          <w:b/>
+          <w:bCs/>
+        </w:rPr>
+      </w:pPr>
+      <w:r>
+        <w:rPr>
+          <w:b/>
+          <w:bCs/>
+        </w:rPr>
+        <w:t>Title - Custom CSS Classes</w:t>
+      </w:r>
+    </w:p>
+    <w:p>
+      <w:r>
+        <w:rPr>
+          <w:b/>
+          <w:bCs/>
+        </w:rPr>
+        <w:t>Content</w:t>
+      </w:r>
+      <w:r>
+        <w:t xml:space="preserve"> – Apply custom CSS classes to grid elements. Provides fine-grained control for advanced styling scenarios.</w:t>
+      </w:r>
+    </w:p>
+    <w:p>
+      <w:r>
+        <w:rPr>
+          <w:b/>
+          <w:bCs/>
+        </w:rPr>
+        <w:t>Best For</w:t>
+      </w:r>
+      <w:r>
+        <w:t xml:space="preserve"> – Complex styling requirements, third-party CSS frameworks</w:t>
+      </w:r>
+    </w:p>
+    <w:p>
+      <w:r>
+        <w:rPr>
+          <w:b/>
+          <w:bCs/>
+        </w:rPr>
+        <w:t>Use When</w:t>
+      </w:r>
+      <w:r>
+        <w:t xml:space="preserve"> – You need complete control over specific element</w:t>
+      </w:r>
+    </w:p>
+    <w:p>
+      <w:pPr>
+        <w:rPr>
+          <w:b/>
+          <w:bCs/>
+        </w:rPr>
+      </w:pPr>
+      <w:r>
+        <w:rPr>
+          <w:b/>
+          <w:bCs/>
+        </w:rPr>
+        <w:t xml:space="preserve">Option </w:t>
+      </w:r>
+      <w:r>
+        <w:rPr>
+          <w:b/>
+          <w:bCs/>
+        </w:rPr>
+        <w:t>7</w:t>
+      </w:r>
+      <w:r>
+        <w:rPr>
+          <w:b/>
+          <w:bCs/>
+        </w:rPr>
+        <w:t>:</w:t>
+      </w:r>
+    </w:p>
+    <w:p>
+      <w:pPr>
+        <w:rPr>
+          <w:b/>
+          <w:bCs/>
+        </w:rPr>
+      </w:pPr>
+      <w:r>
+        <w:rPr>
+          <w:b/>
+          <w:bCs/>
+        </w:rPr>
+        <w:t>Title – Stacked Header Column</w:t>
+      </w:r>
+    </w:p>
+    <w:p>
+      <w:r>
+        <w:rPr>
+          <w:b/>
+          <w:bCs/>
+        </w:rPr>
+        <w:t>Content</w:t>
+      </w:r>
+      <w:r>
+        <w:t xml:space="preserve"> –</w:t>
+      </w:r>
+      <w:r>
+        <w:rPr>
+          <w:rFonts w:ascii="Segoe UI" w:hAnsi="Segoe UI" w:cs="Segoe UI"/>
+          <w:color w:val="666666"/>
+          <w:sz w:val="21"/>
+          <w:szCs w:val="21"/>
+          <w:shd w:val="clear" w:color="auto" w:fill="FFFFFF"/>
+        </w:rPr>
+        <w:t xml:space="preserve"> </w:t>
+      </w:r>
+      <w:r>
+        <w:t>Display multiple fields stacked vertically within a single column for compact, organized layouts.</w:t>
+      </w:r>
+      <w:r>
+        <w:br/>
+      </w:r>
+      <w:r>
+        <w:br/>
+      </w:r>
+      <w:r>
+        <w:rPr>
+          <w:b/>
+          <w:bCs/>
+        </w:rPr>
+        <w:t>Best For</w:t>
+      </w:r>
+      <w:r>
+        <w:t xml:space="preserve"> – </w:t>
+      </w:r>
+      <w:r>
+        <w:t>Multi-field display, compact layouts, grouped data</w:t>
+      </w:r>
+    </w:p>
+    <w:p>
+      <w:r>
+        <w:rPr>
+          <w:b/>
+          <w:bCs/>
+        </w:rPr>
+        <w:t xml:space="preserve">Use When </w:t>
+      </w:r>
+      <w:r>
+        <w:t>- Y</w:t>
+      </w:r>
+      <w:r>
+        <w:t>ou need to show multiple fields in one column.</w:t>
+      </w:r>
+    </w:p>
+    <w:p>
+      <w:pPr>
+        <w:rPr>
+          <w:b/>
+          <w:bCs/>
+        </w:rPr>
+      </w:pPr>
+      <w:r>
+        <w:rPr>
+          <w:b/>
+          <w:bCs/>
+        </w:rPr>
+        <w:t xml:space="preserve">Option </w:t>
+      </w:r>
+      <w:r>
+        <w:rPr>
+          <w:b/>
+          <w:bCs/>
+        </w:rPr>
+        <w:t>8</w:t>
+      </w:r>
+      <w:r>
+        <w:rPr>
+          <w:b/>
+          <w:bCs/>
+        </w:rPr>
+        <w:t>:</w:t>
+      </w:r>
+    </w:p>
+    <w:p>
+      <w:pPr>
+        <w:rPr>
+          <w:b/>
+          <w:bCs/>
+        </w:rPr>
+      </w:pPr>
+      <w:r>
+        <w:rPr>
+          <w:b/>
+          <w:bCs/>
+        </w:rPr>
+        <w:t>Title – Empty Record Template</w:t>
+      </w:r>
+    </w:p>
+    <w:p>
+      <w:r>
+        <w:rPr>
+          <w:b/>
+          <w:bCs/>
+        </w:rPr>
+        <w:t xml:space="preserve">Content </w:t>
+      </w:r>
+      <w:r>
+        <w:t xml:space="preserve">– </w:t>
+      </w:r>
+      <w:r>
+        <w:t>Design custom empty state messages with helpful guidance when no data matches the current filter.</w:t>
+      </w:r>
+      <w:r>
+        <w:br/>
+      </w:r>
+      <w:r>
+        <w:lastRenderedPageBreak/>
+        <w:br/>
+      </w:r>
+      <w:r>
+        <w:rPr>
+          <w:b/>
+          <w:bCs/>
+        </w:rPr>
+        <w:t>Best For</w:t>
+      </w:r>
+      <w:r>
+        <w:t xml:space="preserve"> – </w:t>
+      </w:r>
+      <w:r>
+        <w:t>Empty states, user guidance, call-to-action</w:t>
+      </w:r>
+    </w:p>
+    <w:p>
+      <w:r>
+        <w:rPr>
+          <w:b/>
+          <w:bCs/>
+        </w:rPr>
+        <w:t>Use When</w:t>
+      </w:r>
+      <w:r>
+        <w:t xml:space="preserve"> - Y</w:t>
+      </w:r>
+      <w:r>
+        <w:t>ou want to customize the no-data experience.</w:t>
+      </w:r>
+    </w:p>
+    <w:p>
+      <w:pPr>
+        <w:rPr>
+          <w:b/>
+          <w:bCs/>
+        </w:rPr>
+      </w:pPr>
+      <w:r>
+        <w:rPr>
+          <w:b/>
+          <w:bCs/>
+        </w:rPr>
+        <w:t xml:space="preserve">Option </w:t>
+      </w:r>
+      <w:r>
+        <w:rPr>
+          <w:b/>
+          <w:bCs/>
+        </w:rPr>
+        <w:t>9</w:t>
+      </w:r>
+      <w:r>
+        <w:rPr>
+          <w:b/>
+          <w:bCs/>
+        </w:rPr>
+        <w:t>:</w:t>
+      </w:r>
+    </w:p>
+    <w:p>
+      <w:pPr>
+        <w:rPr>
+          <w:b/>
+          <w:bCs/>
+        </w:rPr>
+      </w:pPr>
+      <w:r>
+        <w:rPr>
+          <w:b/>
+          <w:bCs/>
+        </w:rPr>
+        <w:t>Title – Filter Template</w:t>
+      </w:r>
+    </w:p>
+    <w:p>
+      <w:r>
+        <w:rPr>
+          <w:b/>
+          <w:bCs/>
+        </w:rPr>
+        <w:t>Content</w:t>
+      </w:r>
+      <w:r>
+        <w:t xml:space="preserve"> – </w:t>
+      </w:r>
+      <w:r>
+        <w:t>Build advanced filter UI with custom dropdowns, date pickers, sliders, and filtering logic.</w:t>
+      </w:r>
+      <w:r>
+        <w:br/>
+      </w:r>
+      <w:r>
+        <w:br/>
+      </w:r>
+      <w:r>
+        <w:rPr>
+          <w:b/>
+          <w:bCs/>
+        </w:rPr>
+        <w:t>Best For</w:t>
+      </w:r>
+      <w:r>
+        <w:t xml:space="preserve"> – </w:t>
+      </w:r>
+      <w:r>
+        <w:t>Advanced filters, date ranges, custom search</w:t>
+      </w:r>
+    </w:p>
+    <w:p>
+      <w:r>
+        <w:rPr>
+          <w:b/>
+          <w:bCs/>
+        </w:rPr>
+        <w:t>Use When</w:t>
+      </w:r>
+      <w:r>
+        <w:t xml:space="preserve"> - F</w:t>
+      </w:r>
+      <w:r>
+        <w:t>ilters need custom controls or logic.</w:t>
+      </w:r>
+    </w:p>
+    <w:p>
+      <w:pPr>
+        <w:rPr>
+          <w:b/>
+          <w:bCs/>
+        </w:rPr>
+      </w:pPr>
+      <w:r>
+        <w:rPr>
+          <w:b/>
+          <w:bCs/>
+        </w:rPr>
+        <w:t xml:space="preserve">Option </w:t>
+      </w:r>
+      <w:r>
+        <w:rPr>
+          <w:b/>
+          <w:bCs/>
+        </w:rPr>
+        <w:t>10</w:t>
+      </w:r>
+      <w:r>
+        <w:rPr>
+          <w:b/>
+          <w:bCs/>
+        </w:rPr>
+        <w:t>:</w:t>
+      </w:r>
+    </w:p>
+    <w:p>
+      <w:pPr>
+        <w:rPr>
+          <w:b/>
+          <w:bCs/>
+        </w:rPr>
+      </w:pPr>
+      <w:r>
+        <w:rPr>
+          <w:b/>
+          <w:bCs/>
+        </w:rPr>
+        <w:t>Title – Row Template</w:t>
+      </w:r>
+    </w:p>
+    <w:p>
+      <w:r>
+        <w:rPr>
+          <w:b/>
+          <w:bCs/>
+        </w:rPr>
+        <w:t>Content</w:t>
+      </w:r>
+      <w:r>
+        <w:t xml:space="preserve"> – </w:t>
+      </w:r>
+      <w:r>
+        <w:t>Completely customize entire row layouts with conditional styling, actions, and complex markup.</w:t>
+      </w:r>
+      <w:r>
+        <w:br/>
+      </w:r>
+      <w:r>
+        <w:br/>
+      </w:r>
+      <w:r>
+        <w:rPr>
+          <w:b/>
+          <w:bCs/>
+        </w:rPr>
+        <w:t>Best For</w:t>
+      </w:r>
+      <w:r>
+        <w:t xml:space="preserve"> – </w:t>
+      </w:r>
+      <w:r>
+        <w:t>Custom row layouts, complex hierarchies, conditional styling</w:t>
+      </w:r>
+    </w:p>
+    <w:p>
+      <w:r>
+        <w:rPr>
+          <w:b/>
+          <w:bCs/>
+        </w:rPr>
+        <w:t>Use When</w:t>
+      </w:r>
+      <w:r>
+        <w:t xml:space="preserve"> - E</w:t>
+      </w:r>
+      <w:r>
+        <w:t>ntire rows need custom structure.</w:t>
+      </w:r>
+    </w:p>
+    <w:p>
+      <w:pPr>
+        <w:pStyle w:val="Heading1"/>
+      </w:pPr>
+      <w:r>
+        <w:t>5. Implementation Resources</w:t>
+      </w:r>
+    </w:p>
+    <w:p/>
+    <w:p>
+      <w:r>
+        <w:rPr>
+          <w:b/>
+          <w:bCs/>
+        </w:rPr>
+        <w:t>Hero eyebrow</w:t>
+      </w:r>
+      <w:r>
+        <w:t xml:space="preserve"> – </w:t>
+      </w:r>
+      <w:r>
+        <w:t>Implementation Resources</w:t>
+      </w:r>
+    </w:p>
+    <w:p>
+      <w:r>
+        <w:rPr>
+          <w:b/>
+          <w:bCs/>
+        </w:rPr>
+        <w:t>Main title</w:t>
+      </w:r>
+      <w:r>
+        <w:t xml:space="preserve"> – </w:t>
+      </w:r>
+      <w:r>
+        <w:t>Explore Templates Demos and Documentation</w:t>
+      </w:r>
+    </w:p>
+    <w:p>
+      <w:r>
+        <w:rPr>
+          <w:b/>
+          <w:bCs/>
+        </w:rPr>
+        <w:t>Subtitle</w:t>
+      </w:r>
+      <w:r>
+        <w:t xml:space="preserve"> – </w:t>
+      </w:r>
+      <w:r>
+        <w:t>Explore documentation, demos, guides, and sample implementations to build grid templates efficiently.</w:t>
+      </w:r>
+    </w:p>
+    <w:p>
+      <w:pPr>
+        <w:rPr>
+          <w:b/>
+          <w:bCs/>
+        </w:rPr>
+      </w:pPr>
+      <w:r>
+        <w:rPr>
+          <w:b/>
+          <w:bCs/>
+        </w:rPr>
+        <w:t>Option 1:</w:t>
+      </w:r>
+    </w:p>
+    <w:p>
+      <w:pPr>
+        <w:rPr>
+          <w:b/>
+          <w:bCs/>
+        </w:rPr>
+      </w:pPr>
+      <w:r>
+        <w:rPr>
+          <w:b/>
+          <w:bCs/>
+        </w:rPr>
+        <w:t>Title - Template Documentation</w:t>
+      </w:r>
+    </w:p>
+    <w:p>
+      <w:r>
+        <w:rPr>
+          <w:b/>
+          <w:bCs/>
+        </w:rPr>
+        <w:t>Content</w:t>
+      </w:r>
+      <w:r>
+        <w:t xml:space="preserve"> - </w:t>
+      </w:r>
+      <w:r>
+        <w:t>Complete guide to all template types with API references and configuration options.</w:t>
+      </w:r>
+    </w:p>
+    <w:p>
+      <w:r>
+        <w:rPr>
+          <w:b/>
+          <w:bCs/>
+        </w:rPr>
+        <w:t>Read Guide / View Demo / Try it now –</w:t>
+      </w:r>
+      <w:r>
+        <w:t xml:space="preserve"> </w:t>
+      </w:r>
+      <w:hyperlink r:id="rId7" w:history="1">
+        <w:r>
+          <w:rPr>
+            <w:rStyle w:val="Hyperlink"/>
+          </w:rPr>
+          <w:t>https://ej2.syncfusion.com/react/documentation/grid/columns/column-template</w:t>
+        </w:r>
+      </w:hyperlink>
       <w:r>
         <w:t xml:space="preserve"> </w:t>
       </w:r>
@@ -1508,7 +1469,7 @@
       <w:r>
         <w:t xml:space="preserve"> </w:t>
       </w:r>
-      <w:hyperlink r:id="rId6" w:anchor="theme-customization" w:history="1">
+      <w:hyperlink r:id="rId8" w:anchor="theme-customization" w:history="1">
         <w:r>
           <w:rPr>
             <w:rStyle w:val="Hyperlink"/>
@@ -1594,7 +1555,7 @@
       <w:r>
         <w:t xml:space="preserve">  </w:t>
       </w:r>
-      <w:hyperlink r:id="rId7" w:history="1">
+      <w:hyperlink r:id="rId9" w:history="1">
         <w:r>
           <w:rPr>
             <w:rStyle w:val="Hyperlink"/>
@@ -1676,7 +1637,7 @@
       <w:r>
         <w:t xml:space="preserve"> </w:t>
       </w:r>
-      <w:hyperlink r:id="rId8" w:history="1">
+      <w:hyperlink r:id="rId10" w:history="1">
         <w:r>
           <w:rPr>
             <w:rStyle w:val="Hyperlink"/>
@@ -1762,7 +1723,7 @@
       <w:r>
         <w:t xml:space="preserve"> </w:t>
       </w:r>
-      <w:hyperlink r:id="rId9" w:history="1">
+      <w:hyperlink r:id="rId11" w:history="1">
         <w:r>
           <w:rPr>
             <w:rStyle w:val="Hyperlink"/>
@@ -1838,7 +1799,7 @@
         </w:rPr>
         <w:t xml:space="preserve">Read Guide / View Demo / Try it now – </w:t>
       </w:r>
-      <w:hyperlink r:id="rId10" w:anchor="default-css-override" w:history="1">
+      <w:hyperlink r:id="rId12" w:anchor="default-css-override" w:history="1">
         <w:r>
           <w:rPr>
             <w:rStyle w:val="Hyperlink"/>
@@ -1907,7 +1868,7 @@
       <w:r>
         <w:t xml:space="preserve"> </w:t>
       </w:r>
-      <w:hyperlink r:id="rId11" w:history="1">
+      <w:hyperlink r:id="rId13" w:history="1">
         <w:r>
           <w:rPr>
             <w:rStyle w:val="Hyperlink"/>
@@ -1977,7 +1938,7 @@
       <w:r>
         <w:t xml:space="preserve"> </w:t>
       </w:r>
-      <w:hyperlink r:id="rId12" w:history="1">
+      <w:hyperlink r:id="rId14" w:history="1">
         <w:r>
           <w:rPr>
             <w:rStyle w:val="Hyperlink"/>
@@ -3653,7 +3614,7 @@
         <w:lastRenderedPageBreak/>
         <w:t xml:space="preserve">Read Article - </w:t>
       </w:r>
-      <w:hyperlink r:id="rId13" w:history="1">
+      <w:hyperlink r:id="rId15" w:history="1">
         <w:r>
           <w:rPr>
             <w:rStyle w:val="Hyperlink"/>
@@ -3721,7 +3682,7 @@
       <w:r>
         <w:t xml:space="preserve">Read Article - </w:t>
       </w:r>
-      <w:hyperlink r:id="rId14" w:history="1">
+      <w:hyperlink r:id="rId16" w:history="1">
         <w:r>
           <w:rPr>
             <w:rStyle w:val="Hyperlink"/>
@@ -3820,7 +3781,7 @@
       <w:r>
         <w:t xml:space="preserve"> </w:t>
       </w:r>
-      <w:hyperlink r:id="rId15" w:history="1">
+      <w:hyperlink r:id="rId17" w:history="1">
         <w:r>
           <w:rPr>
             <w:rStyle w:val="Hyperlink"/>
@@ -3899,7 +3860,7 @@
       <w:r>
         <w:t xml:space="preserve"> </w:t>
       </w:r>
-      <w:hyperlink r:id="rId16" w:history="1">
+      <w:hyperlink r:id="rId18" w:history="1">
         <w:r>
           <w:rPr>
             <w:rStyle w:val="Hyperlink"/>
@@ -3997,7 +3958,7 @@
       <w:r>
         <w:t xml:space="preserve"> </w:t>
       </w:r>
-      <w:hyperlink r:id="rId17" w:history="1">
+      <w:hyperlink r:id="rId19" w:history="1">
         <w:r>
           <w:rPr>
             <w:rStyle w:val="Hyperlink"/>
@@ -4022,6 +3983,92 @@
 <file path=word/numbering.xml><?xml version="1.0" encoding="utf-8"?>
 <w:numbering xmlns:wpc="http://schemas.microsoft.com/office/word/2010/wordprocessingCanvas" xmlns:cx="http://schemas.microsoft.com/office/drawing/2014/chartex" xmlns:cx1="http://schemas.microsoft.com/office/drawing/2015/9/8/chartex" xmlns:cx2="http://schemas.microsoft.com/office/drawing/2015/10/21/chartex" xmlns:cx3="http://schemas.microsoft.com/office/drawing/2016/5/9/chartex" xmlns:cx4="http://schemas.microsoft.com/office/drawing/2016/5/10/chartex" xmlns:cx5="http://schemas.microsoft.com/office/drawing/2016/5/11/chartex" xmlns:cx6="http://schemas.microsoft.com/office/drawing/2016/5/12/chartex" xmlns:cx7="http://schemas.microsoft.com/office/drawing/2016/5/13/chartex" xmlns:cx8="http://schemas.microsoft.com/office/drawing/2016/5/14/chartex" xmlns:mc="http://schemas.openxmlformats.org/markup-compatibility/2006" xmlns:aink="http://schemas.microsoft.com/office/drawing/2016/ink" xmlns:am3d="http://schemas.microsoft.com/office/drawing/2017/model3d" xmlns:o="urn:schemas-microsoft-com:office:office" xmlns:oel="http://schemas.microsoft.com/office/2019/extlst" xmlns:r="http://schemas.openxmlformats.org/officeDocument/2006/relationships" xmlns:m="http://schemas.openxmlformats.org/officeDocument/2006/math" xmlns:v="urn:schemas-microsoft-com:vml" xmlns:wp14="http://schemas.microsoft.com/office/word/2010/wordprocessingDrawing" xmlns:wp="http://schemas.openxmlformats.org/drawingml/2006/wordprocessingDrawing" xmlns:w10="urn:schemas-microsoft-com:office:word" xmlns:w="http://schemas.openxmlformats.org/wordprocessingml/2006/main" xmlns:w14="http://schemas.microsoft.com/office/word/2010/wordml" xmlns:w15="http://schemas.microsoft.com/office/word/2012/wordml" xmlns:w16cex="http://schemas.microsoft.com/office/word/2018/wordml/cex" xmlns:w16cid="http://schemas.microsoft.com/office/word/2016/wordml/cid" xmlns:w16="http://schemas.microsoft.com/office/word/2018/wordml" xmlns:w16du="http://schemas.microsoft.com/office/word/2023/wordml/word16du" xmlns:w16sdtdh="http://schemas.microsoft.com/office/word/2020/wordml/sdtdatahash" xmlns:w16sdtfl="http://schemas.microsoft.com/office/word/2024/wordml/sdtformatlock" xmlns:w16se="http://schemas.microsoft.com/office/word/2015/wordml/symex" xmlns:wpg="http://schemas.microsoft.com/office/word/2010/wordprocessingGroup" xmlns:wpi="http://schemas.microsoft.com/office/word/2010/wordprocessingInk" xmlns:wne="http://schemas.microsoft.com/office/word/2006/wordml" xmlns:wps="http://schemas.microsoft.com/office/word/2010/wordprocessingShape" mc:Ignorable="w14 w15 w16se w16cid w16 w16cex w16sdtdh w16sdtfl w16du wp14">
   <w:abstractNum w:abstractNumId="0" w15:restartNumberingAfterBreak="0">
+    <w:nsid w:val="0BA207C1"/>
+    <w:multiLevelType w:val="hybridMultilevel"/>
+    <w:tmpl w:val="74D8F61A"/>
+    <w:lvl w:ilvl="0" w:tplc="0409000F">
+      <w:start w:val="1"/>
+      <w:numFmt w:val="decimal"/>
+      <w:lvlText w:val="%1."/>
+      <w:lvlJc w:val="left"/>
+      <w:pPr>
+        <w:ind w:left="720" w:hanging="360"/>
+      </w:pPr>
+    </w:lvl>
+    <w:lvl w:ilvl="1" w:tplc="04090019" w:tentative="1">
+      <w:start w:val="1"/>
+      <w:numFmt w:val="lowerLetter"/>
+      <w:lvlText w:val="%2."/>
+      <w:lvlJc w:val="left"/>
+      <w:pPr>
+        <w:ind w:left="1440" w:hanging="360"/>
+      </w:pPr>
+    </w:lvl>
+    <w:lvl w:ilvl="2" w:tplc="0409001B" w:tentative="1">
+      <w:start w:val="1"/>
+      <w:numFmt w:val="lowerRoman"/>
+      <w:lvlText w:val="%3."/>
+      <w:lvlJc w:val="right"/>
+      <w:pPr>
+        <w:ind w:left="2160" w:hanging="180"/>
+      </w:pPr>
+    </w:lvl>
+    <w:lvl w:ilvl="3" w:tplc="0409000F" w:tentative="1">
+      <w:start w:val="1"/>
+      <w:numFmt w:val="decimal"/>
+      <w:lvlText w:val="%4."/>
+      <w:lvlJc w:val="left"/>
+      <w:pPr>
+        <w:ind w:left="2880" w:hanging="360"/>
+      </w:pPr>
+    </w:lvl>
+    <w:lvl w:ilvl="4" w:tplc="04090019" w:tentative="1">
+      <w:start w:val="1"/>
+      <w:numFmt w:val="lowerLetter"/>
+      <w:lvlText w:val="%5."/>
+      <w:lvlJc w:val="left"/>
+      <w:pPr>
+        <w:ind w:left="3600" w:hanging="360"/>
+      </w:pPr>
+    </w:lvl>
+    <w:lvl w:ilvl="5" w:tplc="0409001B" w:tentative="1">
+      <w:start w:val="1"/>
+      <w:numFmt w:val="lowerRoman"/>
+      <w:lvlText w:val="%6."/>
+      <w:lvlJc w:val="right"/>
+      <w:pPr>
+        <w:ind w:left="4320" w:hanging="180"/>
+      </w:pPr>
+    </w:lvl>
+    <w:lvl w:ilvl="6" w:tplc="0409000F" w:tentative="1">
+      <w:start w:val="1"/>
+      <w:numFmt w:val="decimal"/>
+      <w:lvlText w:val="%7."/>
+      <w:lvlJc w:val="left"/>
+      <w:pPr>
+        <w:ind w:left="5040" w:hanging="360"/>
+      </w:pPr>
+    </w:lvl>
+    <w:lvl w:ilvl="7" w:tplc="04090019" w:tentative="1">
+      <w:start w:val="1"/>
+      <w:numFmt w:val="lowerLetter"/>
+      <w:lvlText w:val="%8."/>
+      <w:lvlJc w:val="left"/>
+      <w:pPr>
+        <w:ind w:left="5760" w:hanging="360"/>
+      </w:pPr>
+    </w:lvl>
+    <w:lvl w:ilvl="8" w:tplc="0409001B" w:tentative="1">
+      <w:start w:val="1"/>
+      <w:numFmt w:val="lowerRoman"/>
+      <w:lvlText w:val="%9."/>
+      <w:lvlJc w:val="right"/>
+      <w:pPr>
+        <w:ind w:left="6480" w:hanging="180"/>
+      </w:pPr>
+    </w:lvl>
+  </w:abstractNum>
+  <w:abstractNum w:abstractNumId="1" w15:restartNumberingAfterBreak="0">
     <w:nsid w:val="3576310D"/>
     <w:multiLevelType w:val="hybridMultilevel"/>
     <w:tmpl w:val="E3327B68"/>
@@ -4108,6 +4155,9 @@
     </w:lvl>
   </w:abstractNum>
   <w:num w:numId="1" w16cid:durableId="980959404">
+    <w:abstractNumId w:val="1"/>
+  </w:num>
+  <w:num w:numId="2" w16cid:durableId="638615313">
     <w:abstractNumId w:val="0"/>
   </w:num>
 </w:numbering>

</xml_diff>